<commit_message>
report: fix per-type map legibility (aspect, extent, subtitle)
The sparse asset-type maps (power, carbon) rendered grotesquely tall/narrow and
the on-map subtitle overlapped the title. Fix oxy_maps.render: drop the
redundant on-map subtitle (each map is captioned in the report), base the
auto-fit extent on primary assets only (so a far substation can't stretch the
view), and enforce a minimum window + geographic-aspect clamp so tight clusters
still get proper county/highway/city context. Re-render PDF/DOCX + source zip.

Co-Authored-By: Claude Opus 4.8 <noreply@anthropic.com>
Claude-Session: https://claude.ai/code/session_01JtS2Lbux3nazoFadHxqJYu
</commit_message>
<xml_diff>
--- a/outputs/reports/OXY-Intelligence-Report.docx
+++ b/outputs/reports/OXY-Intelligence-Report.docx
@@ -426,7 +426,7 @@
       <w:r>
         <w:drawing>
           <wp:inline>
-            <wp:extent cx="5334000" cy="5327027"/>
+            <wp:extent cx="5334000" cy="6275294"/>
             <wp:effectExtent b="0" l="0" r="0" t="0"/>
             <wp:docPr descr="OXY overview map" title="" id="26" name="Picture"/>
             <a:graphic>
@@ -447,7 +447,7 @@
                   <pic:spPr bwMode="auto">
                     <a:xfrm>
                       <a:off x="0" y="0"/>
-                      <a:ext cx="5334000" cy="5327027"/>
+                      <a:ext cx="5334000" cy="6275294"/>
                     </a:xfrm>
                     <a:prstGeom prst="rect">
                       <a:avLst/>
@@ -756,7 +756,7 @@
       <w:r>
         <w:drawing>
           <wp:inline>
-            <wp:extent cx="5334000" cy="5553635"/>
+            <wp:extent cx="5334000" cy="6275294"/>
             <wp:effectExtent b="0" l="0" r="0" t="0"/>
             <wp:docPr descr="Midstream, pipelines &amp; gas processing map" title="" id="35" name="Picture"/>
             <a:graphic>
@@ -777,7 +777,7 @@
                   <pic:spPr bwMode="auto">
                     <a:xfrm>
                       <a:off x="0" y="0"/>
-                      <a:ext cx="5334000" cy="5553635"/>
+                      <a:ext cx="5334000" cy="6275294"/>
                     </a:xfrm>
                     <a:prstGeom prst="rect">
                       <a:avLst/>
@@ -2143,7 +2143,7 @@
       <w:r>
         <w:drawing>
           <wp:inline>
-            <wp:extent cx="5334000" cy="3123701"/>
+            <wp:extent cx="5334000" cy="3134160"/>
             <wp:effectExtent b="0" l="0" r="0" t="0"/>
             <wp:docPr descr="Water infrastructure map" title="" id="50" name="Picture"/>
             <a:graphic>
@@ -2164,7 +2164,7 @@
                   <pic:spPr bwMode="auto">
                     <a:xfrm>
                       <a:off x="0" y="0"/>
-                      <a:ext cx="5334000" cy="3123701"/>
+                      <a:ext cx="5334000" cy="3134160"/>
                     </a:xfrm>
                     <a:prstGeom prst="rect">
                       <a:avLst/>
@@ -2886,7 +2886,7 @@
       <w:r>
         <w:drawing>
           <wp:inline>
-            <wp:extent cx="5334000" cy="4277658"/>
+            <wp:extent cx="5334000" cy="4514725"/>
             <wp:effectExtent b="0" l="0" r="0" t="0"/>
             <wp:docPr descr="Power generation &amp; NET Power map" title="" id="60" name="Picture"/>
             <a:graphic>
@@ -2907,7 +2907,7 @@
                   <pic:spPr bwMode="auto">
                     <a:xfrm>
                       <a:off x="0" y="0"/>
-                      <a:ext cx="5334000" cy="4277658"/>
+                      <a:ext cx="5334000" cy="4514725"/>
                     </a:xfrm>
                     <a:prstGeom prst="rect">
                       <a:avLst/>
@@ -3505,7 +3505,7 @@
       <w:r>
         <w:drawing>
           <wp:inline>
-            <wp:extent cx="5334000" cy="10884149"/>
+            <wp:extent cx="5334000" cy="4511239"/>
             <wp:effectExtent b="0" l="0" r="0" t="0"/>
             <wp:docPr descr="Carbon capture map" title="" id="69" name="Picture"/>
             <a:graphic>
@@ -3526,7 +3526,7 @@
                   <pic:spPr bwMode="auto">
                     <a:xfrm>
                       <a:off x="0" y="0"/>
-                      <a:ext cx="5334000" cy="10884149"/>
+                      <a:ext cx="5334000" cy="4511239"/>
                     </a:xfrm>
                     <a:prstGeom prst="rect">
                       <a:avLst/>

</xml_diff>